<commit_message>
DSA builder: bake MCR signature image placeholders into template
Adds two new conditional-section + image-placeholder paragraphs to the
master template via a node script (mirrors bake-logo-into-template.cjs):
{#mcrHasSignatory}{%mcrSignatoryImage}{/mcrHasSignatory} above the MCR
signatory's printed name, equivalent for the witness. Installs
docxtemplater-image-module-free; the image module is wired up in the
next commit.

Co-Authored-By: Claude Opus 4.7 (1M context) <noreply@anthropic.com>
</commit_message>
<xml_diff>
--- a/public/MCR_DSA_Master_Template.docx
+++ b/public/MCR_DSA_Master_Template.docx
@@ -3049,6 +3049,11 @@
       </w:r>
     </w:p>
     <w:p>
+      <w:r>
+        <w:t xml:space="preserve">{#mcrHasSignatory}{%mcrSignatoryImage}{/mcrHasSignatory}</w:t>
+      </w:r>
+    </w:p>
+    <w:p>
       <w:pPr>
         <w:spacing w:after="120"/>
       </w:pPr>
@@ -3114,6 +3119,11 @@
           <w:szCs w:val="22"/>
         </w:rPr>
         <w:t xml:space="preserve">Witness:                                                       Position: {mcr.witnessPosition}</w:t>
+      </w:r>
+    </w:p>
+    <w:p>
+      <w:r>
+        <w:t xml:space="preserve">{#mcrHasWitness}{%mcrWitnessImage}{/mcrHasWitness}</w:t>
       </w:r>
     </w:p>
     <w:p>

</xml_diff>

<commit_message>
DSA builder: render pipeline supports optional MCR signature images
Wires docxtemplater-image-module-free into renderToBuffer and adds
three test cases (signed, unsigned, no-stray-tokens). Uses short string
markers in the context rather than passing Buffers directly, because
the image module treats object-valued context entries as already-
rendered parts.

Also fixes the bake script to emit three separate paragraphs per
placeholder — docxtemplater-image-module-free requires the {%...} tag
to be the sole content of its own paragraph or compile fails with
"Raw tag not in paragraph".

Co-Authored-By: Claude Opus 4.7 (1M context) <noreply@anthropic.com>
</commit_message>
<xml_diff>
--- a/public/MCR_DSA_Master_Template.docx
+++ b/public/MCR_DSA_Master_Template.docx
@@ -3050,7 +3050,17 @@
     </w:p>
     <w:p>
       <w:r>
-        <w:t xml:space="preserve">{#mcrHasSignatory}{%mcrSignatoryImage}{/mcrHasSignatory}</w:t>
+        <w:t xml:space="preserve">{#mcrHasSignatory}</w:t>
+      </w:r>
+    </w:p>
+    <w:p>
+      <w:r>
+        <w:t xml:space="preserve">{%mcrSignatoryImage}</w:t>
+      </w:r>
+    </w:p>
+    <w:p>
+      <w:r>
+        <w:t xml:space="preserve">{/mcrHasSignatory}</w:t>
       </w:r>
     </w:p>
     <w:p>
@@ -3123,7 +3133,17 @@
     </w:p>
     <w:p>
       <w:r>
-        <w:t xml:space="preserve">{#mcrHasWitness}{%mcrWitnessImage}{/mcrHasWitness}</w:t>
+        <w:t xml:space="preserve">{#mcrHasWitness}</w:t>
+      </w:r>
+    </w:p>
+    <w:p>
+      <w:r>
+        <w:t xml:space="preserve">{%mcrWitnessImage}</w:t>
+      </w:r>
+    </w:p>
+    <w:p>
+      <w:r>
+        <w:t xml:space="preserve">{/mcrHasWitness}</w:t>
       </w:r>
     </w:p>
     <w:p>

</xml_diff>

<commit_message>
DSA template: cross-reference Part 8 in the agreed School(s)/Site(s) recitals
Both LA-branch background recitals previously left "the agreed
School(s)/Site(s)" hanging without telling the reader where the
agreed list lives. UK drafting convention is a bracketed cross-
reference — the same form already used in the "School(s)" definition.
Updates the rendered template and the Scotland parity fixture.

Co-Authored-By: Claude Opus 4.7 (1M context) <noreply@anthropic.com>
</commit_message>
<xml_diff>
--- a/public/MCR_DSA_Master_Template.docx
+++ b/public/MCR_DSA_Master_Template.docx
@@ -200,24 +200,24 @@
           <w:sz w:val="22"/>
           <w:szCs w:val="22"/>
         </w:rPr>
-        <w:t xml:space="preserve">The Parties agree to enter into a Data Sharing Agreement to allow the provision by MCR of a Mentoring Programme in {#isLA}the agreed School(s)/Site(s){/isLA}{^isLA}{counterparty.shortName}{/isLA};</w:t>
-      </w:r>
-    </w:p>
-    <w:p>
-      <w:pPr>
-        <w:spacing w:after="120"/>
-      </w:pPr>
-      <w:r>
-        <w:rPr>
-          <w:rFonts w:ascii="Arial" w:cs="Arial" w:eastAsia="Arial" w:hAnsi="Arial"/>
-          <w:b w:val="false"/>
-          <w:bCs w:val="false"/>
-          <w:i w:val="false"/>
-          <w:iCs w:val="false"/>
-          <w:sz w:val="22"/>
-          <w:szCs w:val="22"/>
-        </w:rPr>
-        <w:t xml:space="preserve">MCR will, subject to a separate partnership agreement, be providing a Mentoring Programme, for {counterparty.shortName}{#isLA} at the agreed School(s)/Site(s){/isLA};</w:t>
+        <w:t xml:space="preserve">The Parties agree to enter into a Data Sharing Agreement to allow the provision by MCR of a Mentoring Programme in {#isLA}the agreed School(s)/Site(s) (as detailed at Part 8 of the Schedule){/isLA}{^isLA}{counterparty.shortName}{/isLA};</w:t>
+      </w:r>
+    </w:p>
+    <w:p>
+      <w:pPr>
+        <w:spacing w:after="120"/>
+      </w:pPr>
+      <w:r>
+        <w:rPr>
+          <w:rFonts w:ascii="Arial" w:cs="Arial" w:eastAsia="Arial" w:hAnsi="Arial"/>
+          <w:b w:val="false"/>
+          <w:bCs w:val="false"/>
+          <w:i w:val="false"/>
+          <w:iCs w:val="false"/>
+          <w:sz w:val="22"/>
+          <w:szCs w:val="22"/>
+        </w:rPr>
+        <w:t xml:space="preserve">MCR will, subject to a separate partnership agreement, be providing a Mentoring Programme, for {counterparty.shortName}{#isLA} at the agreed School(s)/Site(s) (as detailed at Part 8 of the Schedule){/isLA};</w:t>
       </w:r>
     </w:p>
     <w:p>

</xml_diff>

<commit_message>
DSA template: cross-reference Part 8 in the agreed School(s)/Site(s) recitals (#22)
Both LA-branch background recitals previously left "the agreed
School(s)/Site(s)" hanging without telling the reader where the
agreed list lives. UK drafting convention is a bracketed cross-
reference — the same form already used in the "School(s)" definition.
Updates the rendered template and the Scotland parity fixture.

Co-authored-by: Claude Opus 4.7 (1M context) <noreply@anthropic.com>
</commit_message>
<xml_diff>
--- a/public/MCR_DSA_Master_Template.docx
+++ b/public/MCR_DSA_Master_Template.docx
@@ -200,24 +200,24 @@
           <w:sz w:val="22"/>
           <w:szCs w:val="22"/>
         </w:rPr>
-        <w:t xml:space="preserve">The Parties agree to enter into a Data Sharing Agreement to allow the provision by MCR of a Mentoring Programme in {#isLA}the agreed School(s)/Site(s){/isLA}{^isLA}{counterparty.shortName}{/isLA};</w:t>
-      </w:r>
-    </w:p>
-    <w:p>
-      <w:pPr>
-        <w:spacing w:after="120"/>
-      </w:pPr>
-      <w:r>
-        <w:rPr>
-          <w:rFonts w:ascii="Arial" w:cs="Arial" w:eastAsia="Arial" w:hAnsi="Arial"/>
-          <w:b w:val="false"/>
-          <w:bCs w:val="false"/>
-          <w:i w:val="false"/>
-          <w:iCs w:val="false"/>
-          <w:sz w:val="22"/>
-          <w:szCs w:val="22"/>
-        </w:rPr>
-        <w:t xml:space="preserve">MCR will, subject to a separate partnership agreement, be providing a Mentoring Programme, for {counterparty.shortName}{#isLA} at the agreed School(s)/Site(s){/isLA};</w:t>
+        <w:t xml:space="preserve">The Parties agree to enter into a Data Sharing Agreement to allow the provision by MCR of a Mentoring Programme in {#isLA}the agreed School(s)/Site(s) (as detailed at Part 8 of the Schedule){/isLA}{^isLA}{counterparty.shortName}{/isLA};</w:t>
+      </w:r>
+    </w:p>
+    <w:p>
+      <w:pPr>
+        <w:spacing w:after="120"/>
+      </w:pPr>
+      <w:r>
+        <w:rPr>
+          <w:rFonts w:ascii="Arial" w:cs="Arial" w:eastAsia="Arial" w:hAnsi="Arial"/>
+          <w:b w:val="false"/>
+          <w:bCs w:val="false"/>
+          <w:i w:val="false"/>
+          <w:iCs w:val="false"/>
+          <w:sz w:val="22"/>
+          <w:szCs w:val="22"/>
+        </w:rPr>
+        <w:t xml:space="preserve">MCR will, subject to a separate partnership agreement, be providing a Mentoring Programme, for {counterparty.shortName}{#isLA} at the agreed School(s)/Site(s) (as detailed at Part 8 of the Schedule){/isLA};</w:t>
       </w:r>
     </w:p>
     <w:p>

</xml_diff>